<commit_message>
Forfeit rule: no lineup = 3-0 forfeit loss (both missing = both lose, 0 pts); forfeits not simulated; standings/scoreboard/schedule/scouting/replay/rulebook updated
Co-Authored-By: Claude Opus 5.5 <noreply@anthropic.com>
</commit_message>
<xml_diff>
--- a/SPM261_01_Soccer_League_Rulebook.docx
+++ b/SPM261_01_Soccer_League_Rulebook.docx
@@ -1448,7 +1448,7 @@
         <w:pStyle w:val="ListNumber"/>
       </w:pPr>
       <w:r>
-        <w:t>If your whole board runs out before your roster is full (bad luck — too many targets taken ahead of you): autopick takes the highest-OVR player still available and affordable — same "league office auto-fills" fallback used for a missed Weekly Lineup submission or a missed Trade Day pairing.</w:t>
+        <w:t>If your whole board runs out before your roster is full (bad luck — too many targets taken ahead of you): autopick takes the highest-OVR player still available and affordable — same "league office auto-fills" fallback used for a missed Trade Day pairing.</w:t>
       </w:r>
     </w:p>
     <w:p/>
@@ -1462,7 +1462,7 @@
     </w:p>
     <w:p>
       <w:r>
-        <w:t>Every round, before the deadline, each owner submits a Weekly Lineup &amp; Strategy form: formation, strategy, starting XI by name, a ticket price if home that round, and a 2-4 sentence rationale (graded — see the Decision Rationale Rubric above). Every submission must also include your team's 4-digit PIN — a submission with a missing or incorrect PIN is rejected and that team is auto-lineup'd instead, so a lineup can't be changed (by accident or on purpose) by anyone but that team's own owner.</w:t>
+        <w:t>Every round, before the deadline, each owner submits a Weekly Lineup &amp; Strategy form: formation, strategy, starting XI by name, a ticket price if home that round, and a 2-4 sentence rationale (graded — see the Decision Rationale Rubric above). Every submission must also include your team's 4-digit PIN — a submission with a missing or incorrect PIN is rejected and that team forfeits the match (see below), so a lineup can't be changed (by accident or on purpose) by anyone but that team's own owner.</w:t>
       </w:r>
     </w:p>
     <w:p>
@@ -1472,7 +1472,7 @@
     </w:p>
     <w:p>
       <w:r>
-        <w:t>If you do not submit: the league office auto-fills your highest-rated available player at each position, Balanced strategy, Standard pricing. Your match is still played and still counts — you simply forfeit rationale credit, since there is no decision to grade.</w:t>
+        <w:t>If you do not submit, you forfeit the match. A team with no valid Weekly Lineup by the deadline (including a submission rejected for a wrong PIN) loses 3-0 by forfeit: the match is not played, your opponent gets the win and 3 points, and you earn no rationale credit for that round. If neither team submits, both teams take a loss (0 points each). A home team that did submit still sells tickets at its chosen price and keeps the whole gate; a forfeiting team earns no ticket revenue from that match.</w:t>
       </w:r>
     </w:p>
     <w:p>

</xml_diff>

<commit_message>
Forfeits hidden from students (look like normal results; private Forfeits tab in instructor Sheet); blank rationale = no lineup
Co-Authored-By: Claude Opus 5.5 <noreply@anthropic.com>
</commit_message>
<xml_diff>
--- a/SPM261_01_Soccer_League_Rulebook.docx
+++ b/SPM261_01_Soccer_League_Rulebook.docx
@@ -1462,7 +1462,7 @@
     </w:p>
     <w:p>
       <w:r>
-        <w:t>Every round, before the deadline, each owner submits a Weekly Lineup &amp; Strategy form: formation, strategy, starting XI by name, a ticket price if home that round, and a 2-4 sentence rationale (graded — see the Decision Rationale Rubric above). Every submission must also include your team's 4-digit PIN — a submission with a missing or incorrect PIN is rejected and that team forfeits the match (see below), so a lineup can't be changed (by accident or on purpose) by anyone but that team's own owner.</w:t>
+        <w:t>Every round, before the deadline, each owner submits a Weekly Lineup &amp; Strategy form: formation, strategy, starting XI by name, a ticket price if home that round, and a 2-4 sentence rationale (graded — see the Decision Rationale Rubric above). Every submission must also include your team's 4-digit PIN — a submission with a missing or incorrect PIN is rejected and treated as not submitted (see below), so a lineup can't be changed (by accident or on purpose) by anyone but that team's own owner.</w:t>
       </w:r>
     </w:p>
     <w:p>
@@ -1472,7 +1472,7 @@
     </w:p>
     <w:p>
       <w:r>
-        <w:t>If you do not submit, you forfeit the match. A team with no valid Weekly Lineup by the deadline (including a submission rejected for a wrong PIN) loses 3-0 by forfeit: the match is not played, your opponent gets the win and 3 points, and you earn no rationale credit for that round. If neither team submits, both teams take a loss (0 points each). A home team that did submit still sells tickets at its chosen price and keeps the whole gate; a forfeiting team earns no ticket revenue from that match.</w:t>
+        <w:t>If you do not submit a complete Weekly Lineup — every field, including your decision rationale — by the deadline (or your submission is rejected for a wrong PIN), your team is penalized for that round and you earn no rationale credit.</w:t>
       </w:r>
     </w:p>
     <w:p>

</xml_diff>

<commit_message>
Health Hub: treatment prices cut 50% (75K/200K/375K/50K/125K)
Co-Authored-By: Claude Opus 5.5 <noreply@anthropic.com>
</commit_message>
<xml_diff>
--- a/SPM261_01_Soccer_League_Rulebook.docx
+++ b/SPM261_01_Soccer_League_Rulebook.docx
@@ -1369,6 +1369,302 @@
     <w:p>
       <w:r>
         <w:t>While injured, a player's Condition badge shows "Injured" (not one of the five routine tiers above) with how many rounds they're still out for — visible on the dashboard and in the weekly report exactly like ordinary form, before you submit. An already-injured player who gets started anyway just keeps counting down; they cannot get newly hurt on top of an existing injury. Bench them, or play them at a real, known cost — that decision, and being able to see it coming, is the point.</w:t>
+      </w:r>
+    </w:p>
+    <w:p>
+      <w:pPr>
+        <w:pStyle w:val="Heading2"/>
+      </w:pPr>
+      <w:r>
+        <w:t>Player Health Hub</w:t>
+      </w:r>
+    </w:p>
+    <w:p>
+      <w:r>
+        <w:t>From Round 3, owners can pay for treatment on the Player Health Hub page. Every treatment applies to the next round to be played and is paid from your team's cash on hand (shown on the Budget Dashboard). Spending reduces cash only; it does not reduce the Revenue component of the Season Scorecard.</w:t>
+      </w:r>
+    </w:p>
+    <w:tbl>
+      <w:tblPr>
+        <w:tblStyle w:val="LightGrid-Accent1"/>
+        <w:tblW w:type="auto" w:w="0"/>
+        <w:tblLook w:firstColumn="1" w:firstRow="1" w:lastColumn="0" w:lastRow="0" w:noHBand="0" w:noVBand="1" w:val="04A0"/>
+      </w:tblPr>
+      <w:tblGrid>
+        <w:gridCol w:w="2160"/>
+        <w:gridCol w:w="2160"/>
+        <w:gridCol w:w="2160"/>
+        <w:gridCol w:w="2160"/>
+      </w:tblGrid>
+      <w:tr>
+        <w:tc>
+          <w:tcPr>
+            <w:tcW w:type="dxa" w:w="2160"/>
+          </w:tcPr>
+          <w:p>
+            <w:r>
+              <w:rPr>
+                <w:b/>
+              </w:rPr>
+              <w:t>Treatment</w:t>
+            </w:r>
+          </w:p>
+        </w:tc>
+        <w:tc>
+          <w:tcPr>
+            <w:tcW w:type="dxa" w:w="2160"/>
+          </w:tcPr>
+          <w:p>
+            <w:r>
+              <w:rPr>
+                <w:b/>
+              </w:rPr>
+              <w:t>For</w:t>
+            </w:r>
+          </w:p>
+        </w:tc>
+        <w:tc>
+          <w:tcPr>
+            <w:tcW w:type="dxa" w:w="2160"/>
+          </w:tcPr>
+          <w:p>
+            <w:r>
+              <w:rPr>
+                <w:b/>
+              </w:rPr>
+              <w:t>Effect</w:t>
+            </w:r>
+          </w:p>
+        </w:tc>
+        <w:tc>
+          <w:tcPr>
+            <w:tcW w:type="dxa" w:w="2160"/>
+          </w:tcPr>
+          <w:p>
+            <w:r>
+              <w:rPr>
+                <w:b/>
+              </w:rPr>
+              <w:t>Cost</w:t>
+            </w:r>
+          </w:p>
+        </w:tc>
+      </w:tr>
+      <w:tr>
+        <w:tc>
+          <w:tcPr>
+            <w:tcW w:type="dxa" w:w="2160"/>
+          </w:tcPr>
+          <w:p>
+            <w:r>
+              <w:t>Standard Rehab</w:t>
+            </w:r>
+          </w:p>
+        </w:tc>
+        <w:tc>
+          <w:tcPr>
+            <w:tcW w:type="dxa" w:w="2160"/>
+          </w:tcPr>
+          <w:p>
+            <w:r>
+              <w:t>Injured players</w:t>
+            </w:r>
+          </w:p>
+        </w:tc>
+        <w:tc>
+          <w:tcPr>
+            <w:tcW w:type="dxa" w:w="2160"/>
+          </w:tcPr>
+          <w:p>
+            <w:r>
+              <w:t>Returns 1 round sooner</w:t>
+            </w:r>
+          </w:p>
+        </w:tc>
+        <w:tc>
+          <w:tcPr>
+            <w:tcW w:type="dxa" w:w="2160"/>
+          </w:tcPr>
+          <w:p>
+            <w:r>
+              <w:t>$75,000</w:t>
+            </w:r>
+          </w:p>
+        </w:tc>
+      </w:tr>
+      <w:tr>
+        <w:tc>
+          <w:tcPr>
+            <w:tcW w:type="dxa" w:w="2160"/>
+          </w:tcPr>
+          <w:p>
+            <w:r>
+              <w:t>Accelerated Rehab</w:t>
+            </w:r>
+          </w:p>
+        </w:tc>
+        <w:tc>
+          <w:tcPr>
+            <w:tcW w:type="dxa" w:w="2160"/>
+          </w:tcPr>
+          <w:p>
+            <w:r>
+              <w:t>Injured players</w:t>
+            </w:r>
+          </w:p>
+        </w:tc>
+        <w:tc>
+          <w:tcPr>
+            <w:tcW w:type="dxa" w:w="2160"/>
+          </w:tcPr>
+          <w:p>
+            <w:r>
+              <w:t>Returns 2 rounds sooner</w:t>
+            </w:r>
+          </w:p>
+        </w:tc>
+        <w:tc>
+          <w:tcPr>
+            <w:tcW w:type="dxa" w:w="2160"/>
+          </w:tcPr>
+          <w:p>
+            <w:r>
+              <w:t>$200,000</w:t>
+            </w:r>
+          </w:p>
+        </w:tc>
+      </w:tr>
+      <w:tr>
+        <w:tc>
+          <w:tcPr>
+            <w:tcW w:type="dxa" w:w="2160"/>
+          </w:tcPr>
+          <w:p>
+            <w:r>
+              <w:t>Elite Specialist Clinic</w:t>
+            </w:r>
+          </w:p>
+        </w:tc>
+        <w:tc>
+          <w:tcPr>
+            <w:tcW w:type="dxa" w:w="2160"/>
+          </w:tcPr>
+          <w:p>
+            <w:r>
+              <w:t>Injured players</w:t>
+            </w:r>
+          </w:p>
+        </w:tc>
+        <w:tc>
+          <w:tcPr>
+            <w:tcW w:type="dxa" w:w="2160"/>
+          </w:tcPr>
+          <w:p>
+            <w:r>
+              <w:t>Fit for next round, at Average condition</w:t>
+            </w:r>
+          </w:p>
+        </w:tc>
+        <w:tc>
+          <w:tcPr>
+            <w:tcW w:type="dxa" w:w="2160"/>
+          </w:tcPr>
+          <w:p>
+            <w:r>
+              <w:t>$375,000</w:t>
+            </w:r>
+          </w:p>
+        </w:tc>
+      </w:tr>
+      <w:tr>
+        <w:tc>
+          <w:tcPr>
+            <w:tcW w:type="dxa" w:w="2160"/>
+          </w:tcPr>
+          <w:p>
+            <w:r>
+              <w:t>Recovery Session</w:t>
+            </w:r>
+          </w:p>
+        </w:tc>
+        <w:tc>
+          <w:tcPr>
+            <w:tcW w:type="dxa" w:w="2160"/>
+          </w:tcPr>
+          <w:p>
+            <w:r>
+              <w:t>Healthy players</w:t>
+            </w:r>
+          </w:p>
+        </w:tc>
+        <w:tc>
+          <w:tcPr>
+            <w:tcW w:type="dxa" w:w="2160"/>
+          </w:tcPr>
+          <w:p>
+            <w:r>
+              <w:t>+1 condition level next round</w:t>
+            </w:r>
+          </w:p>
+        </w:tc>
+        <w:tc>
+          <w:tcPr>
+            <w:tcW w:type="dxa" w:w="2160"/>
+          </w:tcPr>
+          <w:p>
+            <w:r>
+              <w:t>$50,000</w:t>
+            </w:r>
+          </w:p>
+        </w:tc>
+      </w:tr>
+      <w:tr>
+        <w:tc>
+          <w:tcPr>
+            <w:tcW w:type="dxa" w:w="2160"/>
+          </w:tcPr>
+          <w:p>
+            <w:r>
+              <w:t>Sports-Science Package</w:t>
+            </w:r>
+          </w:p>
+        </w:tc>
+        <w:tc>
+          <w:tcPr>
+            <w:tcW w:type="dxa" w:w="2160"/>
+          </w:tcPr>
+          <w:p>
+            <w:r>
+              <w:t>Healthy players</w:t>
+            </w:r>
+          </w:p>
+        </w:tc>
+        <w:tc>
+          <w:tcPr>
+            <w:tcW w:type="dxa" w:w="2160"/>
+          </w:tcPr>
+          <w:p>
+            <w:r>
+              <w:t>+2 condition levels next round (max Excellent)</w:t>
+            </w:r>
+          </w:p>
+        </w:tc>
+        <w:tc>
+          <w:tcPr>
+            <w:tcW w:type="dxa" w:w="2160"/>
+          </w:tcPr>
+          <w:p>
+            <w:r>
+              <w:t>$125,000</w:t>
+            </w:r>
+          </w:p>
+        </w:tc>
+      </w:tr>
+    </w:tbl>
+    <w:p/>
+    <w:p>
+      <w:r>
+        <w:t>Limit: 4 treatments per team per round, one per player. Condition cannot rise above Excellent. Requests are processed about every 30 minutes, and the weekly Player Condition report updates to show the effect before you submit your lineup. A request that fails a check (not enough cash, round already played, limit reached) is voided at no cost. Explain any treatment in that round's lineup rationale; it is scored under Business/Financial Reasoning.</w:t>
       </w:r>
     </w:p>
     <w:p>

</xml_diff>

<commit_message>
Rulebook: Player Health Hub is now its own Section 5 (web + Word), with how-to-book and GM guidance; later sections renumbered; Weekly Operations + Glossary mention it
Co-Authored-By: Claude Opus 5.5 <noreply@anthropic.com>
</commit_message>
<xml_diff>
--- a/SPM261_01_Soccer_League_Rulebook.docx
+++ b/SPM261_01_Soccer_League_Rulebook.docx
@@ -1373,10 +1373,10 @@
     </w:p>
     <w:p>
       <w:pPr>
-        <w:pStyle w:val="Heading2"/>
+        <w:pStyle w:val="Heading1"/>
       </w:pPr>
       <w:r>
-        <w:t>Player Health Hub</w:t>
+        <w:t>5. Player Health Hub</w:t>
       </w:r>
     </w:p>
     <w:p>
@@ -1668,11 +1668,21 @@
       </w:r>
     </w:p>
     <w:p>
+      <w:r>
+        <w:t>How to book: open the Player Health Hub page, choose your team, enter your team PIN, pick the player and the treatment, and submit. Book before you submit that round's Weekly Lineup, then check the Player Condition report to confirm the treatment took effect.</w:t>
+      </w:r>
+    </w:p>
+    <w:p>
+      <w:r>
+        <w:t>Thinking like a general manager: treatment is an investment decision. Weigh the cost against what the player is worth to your result this round: a star forward back two rounds early in a tight playoff race is worth far more than a squad player in a match you are expected to win comfortably.</w:t>
+      </w:r>
+    </w:p>
+    <w:p>
       <w:pPr>
         <w:pStyle w:val="Heading1"/>
       </w:pPr>
       <w:r>
-        <w:t>5. The Draft</w:t>
+        <w:t>6. The Draft</w:t>
       </w:r>
     </w:p>
     <w:p>
@@ -1753,7 +1763,7 @@
         <w:pStyle w:val="Heading1"/>
       </w:pPr>
       <w:r>
-        <w:t>6. Weekly Operations</w:t>
+        <w:t>7. Weekly Operations</w:t>
       </w:r>
     </w:p>
     <w:p>
@@ -1776,7 +1786,7 @@
         <w:pStyle w:val="Heading1"/>
       </w:pPr>
       <w:r>
-        <w:t>7. Formations &amp; Strategy</w:t>
+        <w:t>8. Formations &amp; Strategy</w:t>
       </w:r>
     </w:p>
     <w:tbl>
@@ -2232,7 +2242,7 @@
         <w:pStyle w:val="Heading1"/>
       </w:pPr>
       <w:r>
-        <w:t>8. How Match Results Are Determined</w:t>
+        <w:t>9. How Match Results Are Determined</w:t>
       </w:r>
     </w:p>
     <w:p>
@@ -2299,7 +2309,7 @@
         <w:pStyle w:val="Heading1"/>
       </w:pPr>
       <w:r>
-        <w:t>9. Ticket Sales &amp; Attendance</w:t>
+        <w:t>10. Ticket Sales &amp; Attendance</w:t>
       </w:r>
     </w:p>
     <w:p>
@@ -2472,7 +2482,7 @@
         <w:pStyle w:val="Heading1"/>
       </w:pPr>
       <w:r>
-        <w:t>10. Sponsorship Deals &amp; Negotiation</w:t>
+        <w:t>11. Sponsorship Deals &amp; Negotiation</w:t>
       </w:r>
     </w:p>
     <w:p>
@@ -3930,7 +3940,7 @@
         <w:pStyle w:val="Heading1"/>
       </w:pPr>
       <w:r>
-        <w:t>11. TV / Broadcast Revenue</w:t>
+        <w:t>12. TV / Broadcast Revenue</w:t>
       </w:r>
     </w:p>
     <w:p>
@@ -4175,7 +4185,7 @@
         <w:pStyle w:val="Heading1"/>
       </w:pPr>
       <w:r>
-        <w:t>12. Trades &amp; Free Agency</w:t>
+        <w:t>13. Trades &amp; Free Agency</w:t>
       </w:r>
     </w:p>
     <w:p>
@@ -4216,7 +4226,7 @@
         <w:pStyle w:val="Heading1"/>
       </w:pPr>
       <w:r>
-        <w:t>13. Standings</w:t>
+        <w:t>14. Standings</w:t>
       </w:r>
     </w:p>
     <w:p>
@@ -4229,7 +4239,7 @@
         <w:pStyle w:val="Heading1"/>
       </w:pPr>
       <w:r>
-        <w:t>14. Playoff Qualification</w:t>
+        <w:t>15. Playoff Qualification</w:t>
       </w:r>
     </w:p>
     <w:p>
@@ -4309,7 +4319,7 @@
         <w:pStyle w:val="Heading1"/>
       </w:pPr>
       <w:r>
-        <w:t>15. Glossary</w:t>
+        <w:t>16. Glossary</w:t>
       </w:r>
     </w:p>
     <w:tbl>
@@ -4504,6 +4514,72 @@
           </w:p>
         </w:tc>
       </w:tr>
+      <w:tr>
+        <w:tc>
+          <w:tcPr>
+            <w:tcW w:type="dxa" w:w="4320"/>
+          </w:tcPr>
+          <w:p>
+            <w:r>
+              <w:t>Player Health Hub</w:t>
+            </w:r>
+          </w:p>
+        </w:tc>
+        <w:tc>
+          <w:tcPr>
+            <w:tcW w:type="dxa" w:w="4320"/>
+          </w:tcPr>
+          <w:p>
+            <w:r>
+              <w:t>The page where owners pay for treatment: rehab to bring an injured player back sooner, or recovery to lift a healthy player's condition for the next round</w:t>
+            </w:r>
+          </w:p>
+        </w:tc>
+      </w:tr>
+      <w:tr>
+        <w:tc>
+          <w:tcPr>
+            <w:tcW w:type="dxa" w:w="4320"/>
+          </w:tcPr>
+          <w:p>
+            <w:r>
+              <w:t>Rehab</w:t>
+            </w:r>
+          </w:p>
+        </w:tc>
+        <w:tc>
+          <w:tcPr>
+            <w:tcW w:type="dxa" w:w="4320"/>
+          </w:tcPr>
+          <w:p>
+            <w:r>
+              <w:t>Paid treatment for an injured player that shortens the time out (Standard, Accelerated, or Elite Specialist Clinic)</w:t>
+            </w:r>
+          </w:p>
+        </w:tc>
+      </w:tr>
+      <w:tr>
+        <w:tc>
+          <w:tcPr>
+            <w:tcW w:type="dxa" w:w="4320"/>
+          </w:tcPr>
+          <w:p>
+            <w:r>
+              <w:t>Medical spend</w:t>
+            </w:r>
+          </w:p>
+        </w:tc>
+        <w:tc>
+          <w:tcPr>
+            <w:tcW w:type="dxa" w:w="4320"/>
+          </w:tcPr>
+          <w:p>
+            <w:r>
+              <w:t>Team cash spent on Health Hub treatments, shown on the Budget Dashboard</w:t>
+            </w:r>
+          </w:p>
+        </w:tc>
+      </w:tr>
     </w:tbl>
     <w:p/>
     <w:p>
@@ -4511,7 +4587,7 @@
         <w:pStyle w:val="Heading1"/>
       </w:pPr>
       <w:r>
-        <w:t>16. Season Calendar</w:t>
+        <w:t>17. Season Calendar</w:t>
       </w:r>
     </w:p>
     <w:p>

</xml_diff>